<commit_message>
feat: localise the questionnaire for Victoria, Australia
Swaps the British examples and options for Australian ones: GST and ABN, the
REC number and Energy Safe Victoria, Master Electricians/NECA, White Card and
LVR tickets, hipages and similar review sites, dollars, Melbourne suburbs,
and AU job software. Structure unchanged: 14 sections, 78 questions, 22
blockers, same storage keys. Live page republished to the same URL.

Co-Authored-By: Claude Opus 5.5 <noreply@anthropic.com>
Claude-Session: https://claude.ai/code/session_01HrV2Kz1Qa2Sx9jBLBLAZB8
</commit_message>
<xml_diff>
--- a/electrician-build-brief.docx
+++ b/electrician-build-brief.docx
@@ -361,7 +361,7 @@
           <w:sz w:val="17"/>
           <w:szCs w:val="17"/>
         </w:rPr>
-        <w:t xml:space="preserve">e.g. United Kingdom</w:t>
+        <w:t xml:space="preserve">e.g. Australia</w:t>
       </w:r>
     </w:p>
     <w:p>
@@ -389,7 +389,7 @@
           <w:sz w:val="21"/>
           <w:szCs w:val="21"/>
         </w:rPr>
-        <w:t xml:space="preserve">State, county or region</w:t>
+        <w:t xml:space="preserve">State and area</w:t>
       </w:r>
     </w:p>
     <w:p>
@@ -412,7 +412,7 @@
           <w:sz w:val="17"/>
           <w:szCs w:val="17"/>
         </w:rPr>
-        <w:t xml:space="preserve">e.g. West Midlands</w:t>
+        <w:t xml:space="preserve">e.g. Victoria — Melbourne's south-east</w:t>
       </w:r>
     </w:p>
     <w:p>
@@ -503,7 +503,7 @@
           <w:sz w:val="21"/>
           <w:szCs w:val="21"/>
         </w:rPr>
-        <w:t xml:space="preserve">Registered legal name</w:t>
+        <w:t xml:space="preserve">Registered business or company name, and ABN</w:t>
       </w:r>
     </w:p>
     <w:p>
@@ -526,7 +526,7 @@
           <w:sz w:val="17"/>
           <w:szCs w:val="17"/>
         </w:rPr>
-        <w:t xml:space="preserve">e.g. Hartley Electrical Services Ltd</w:t>
+        <w:t xml:space="preserve">e.g. BK Electrician Pty Ltd — ABN 12 345 678 901</w:t>
       </w:r>
     </w:p>
     <w:p>
@@ -577,7 +577,7 @@
           <w:sz w:val="17"/>
           <w:szCs w:val="17"/>
         </w:rPr>
-        <w:t xml:space="preserve">e.g. Hartley Electrical</w:t>
+        <w:t xml:space="preserve">e.g. BK Electrician</w:t>
       </w:r>
     </w:p>
     <w:p>
@@ -645,30 +645,30 @@
           <w:sz w:val="20"/>
           <w:szCs w:val="20"/>
         </w:rPr>
-        <w:t xml:space="preserve">Including tax</w:t>
-      </w:r>
-    </w:p>
-    <w:p>
-      <w:pPr>
-        <w:spacing w:after="30" w:line="260"/>
-        <w:ind w:left="200"/>
-      </w:pPr>
-      <w:r>
-        <w:rPr>
-          <w:rFonts w:ascii="Arial" w:cs="Arial" w:eastAsia="Arial" w:hAnsi="Arial"/>
-          <w:color w:val="1B2A30"/>
-          <w:sz w:val="22"/>
-          <w:szCs w:val="22"/>
-        </w:rPr>
-        <w:t xml:space="preserve">☐   </w:t>
-      </w:r>
-      <w:r>
-        <w:rPr>
-          <w:rFonts w:ascii="Arial" w:cs="Arial" w:eastAsia="Arial" w:hAnsi="Arial"/>
-          <w:sz w:val="20"/>
-          <w:szCs w:val="20"/>
-        </w:rPr>
-        <w:t xml:space="preserve">Excluding tax</w:t>
+        <w:t xml:space="preserve">Including GST</w:t>
+      </w:r>
+    </w:p>
+    <w:p>
+      <w:pPr>
+        <w:spacing w:after="30" w:line="260"/>
+        <w:ind w:left="200"/>
+      </w:pPr>
+      <w:r>
+        <w:rPr>
+          <w:rFonts w:ascii="Arial" w:cs="Arial" w:eastAsia="Arial" w:hAnsi="Arial"/>
+          <w:color w:val="1B2A30"/>
+          <w:sz w:val="22"/>
+          <w:szCs w:val="22"/>
+        </w:rPr>
+        <w:t xml:space="preserve">☐   </w:t>
+      </w:r>
+      <w:r>
+        <w:rPr>
+          <w:rFonts w:ascii="Arial" w:cs="Arial" w:eastAsia="Arial" w:hAnsi="Arial"/>
+          <w:sz w:val="20"/>
+          <w:szCs w:val="20"/>
+        </w:rPr>
+        <w:t xml:space="preserve">Excluding GST</w:t>
       </w:r>
     </w:p>
     <w:p>
@@ -721,7 +721,7 @@
           <w:sz w:val="21"/>
           <w:szCs w:val="21"/>
         </w:rPr>
-        <w:t xml:space="preserve">Registered address</w:t>
+        <w:t xml:space="preserve">Registered business address</w:t>
       </w:r>
     </w:p>
     <w:p>
@@ -987,7 +987,7 @@
     <w:p>
       <w:pPr>
         <w:keepNext/>
-        <w:spacing w:after="60" w:before="260"/>
+        <w:spacing w:after="20" w:before="260"/>
       </w:pPr>
       <w:r>
         <w:rPr>
@@ -1009,7 +1009,24 @@
           <w:sz w:val="21"/>
           <w:szCs w:val="21"/>
         </w:rPr>
-        <w:t xml:space="preserve">Electrical licence or registration number</w:t>
+        <w:t xml:space="preserve">REC number and A-grade licence number</w:t>
+      </w:r>
+    </w:p>
+    <w:p>
+      <w:pPr>
+        <w:keepNext/>
+        <w:spacing w:after="60"/>
+      </w:pPr>
+      <w:r>
+        <w:rPr>
+          <w:rFonts w:ascii="Arial" w:cs="Arial" w:eastAsia="Arial" w:hAnsi="Arial"/>
+          <w:i/>
+          <w:iCs/>
+          <w:color w:val="6B7678"/>
+          <w:sz w:val="17"/>
+          <w:szCs w:val="17"/>
+        </w:rPr>
+        <w:t xml:space="preserve">Your REC number has to appear on the website — Energy Safe Victoria requires it on all advertising.</w:t>
       </w:r>
     </w:p>
     <w:p>
@@ -1080,7 +1097,7 @@
           <w:sz w:val="17"/>
           <w:szCs w:val="17"/>
         </w:rPr>
-        <w:t xml:space="preserve">e.g. NICEIC · NAPIT · SELECT · state licensing board</w:t>
+        <w:t xml:space="preserve">e.g. Energy Safe Victoria</w:t>
       </w:r>
     </w:p>
     <w:p>
@@ -1177,145 +1194,7 @@
           <w:sz w:val="20"/>
           <w:szCs w:val="20"/>
         </w:rPr>
-        <w:t xml:space="preserve">NICEIC</w:t>
-      </w:r>
-    </w:p>
-    <w:p>
-      <w:pPr>
-        <w:spacing w:after="30" w:line="260"/>
-        <w:ind w:left="200"/>
-      </w:pPr>
-      <w:r>
-        <w:rPr>
-          <w:rFonts w:ascii="Arial" w:cs="Arial" w:eastAsia="Arial" w:hAnsi="Arial"/>
-          <w:color w:val="1B2A30"/>
-          <w:sz w:val="22"/>
-          <w:szCs w:val="22"/>
-        </w:rPr>
-        <w:t xml:space="preserve">☐   </w:t>
-      </w:r>
-      <w:r>
-        <w:rPr>
-          <w:rFonts w:ascii="Arial" w:cs="Arial" w:eastAsia="Arial" w:hAnsi="Arial"/>
-          <w:sz w:val="20"/>
-          <w:szCs w:val="20"/>
-        </w:rPr>
-        <w:t xml:space="preserve">NAPIT</w:t>
-      </w:r>
-    </w:p>
-    <w:p>
-      <w:pPr>
-        <w:spacing w:after="30" w:line="260"/>
-        <w:ind w:left="200"/>
-      </w:pPr>
-      <w:r>
-        <w:rPr>
-          <w:rFonts w:ascii="Arial" w:cs="Arial" w:eastAsia="Arial" w:hAnsi="Arial"/>
-          <w:color w:val="1B2A30"/>
-          <w:sz w:val="22"/>
-          <w:szCs w:val="22"/>
-        </w:rPr>
-        <w:t xml:space="preserve">☐   </w:t>
-      </w:r>
-      <w:r>
-        <w:rPr>
-          <w:rFonts w:ascii="Arial" w:cs="Arial" w:eastAsia="Arial" w:hAnsi="Arial"/>
-          <w:sz w:val="20"/>
-          <w:szCs w:val="20"/>
-        </w:rPr>
-        <w:t xml:space="preserve">ELECSA</w:t>
-      </w:r>
-    </w:p>
-    <w:p>
-      <w:pPr>
-        <w:spacing w:after="30" w:line="260"/>
-        <w:ind w:left="200"/>
-      </w:pPr>
-      <w:r>
-        <w:rPr>
-          <w:rFonts w:ascii="Arial" w:cs="Arial" w:eastAsia="Arial" w:hAnsi="Arial"/>
-          <w:color w:val="1B2A30"/>
-          <w:sz w:val="22"/>
-          <w:szCs w:val="22"/>
-        </w:rPr>
-        <w:t xml:space="preserve">☐   </w:t>
-      </w:r>
-      <w:r>
-        <w:rPr>
-          <w:rFonts w:ascii="Arial" w:cs="Arial" w:eastAsia="Arial" w:hAnsi="Arial"/>
-          <w:sz w:val="20"/>
-          <w:szCs w:val="20"/>
-        </w:rPr>
-        <w:t xml:space="preserve">SELECT</w:t>
-      </w:r>
-    </w:p>
-    <w:p>
-      <w:pPr>
-        <w:spacing w:after="30" w:line="260"/>
-        <w:ind w:left="200"/>
-      </w:pPr>
-      <w:r>
-        <w:rPr>
-          <w:rFonts w:ascii="Arial" w:cs="Arial" w:eastAsia="Arial" w:hAnsi="Arial"/>
-          <w:color w:val="1B2A30"/>
-          <w:sz w:val="22"/>
-          <w:szCs w:val="22"/>
-        </w:rPr>
-        <w:t xml:space="preserve">☐   </w:t>
-      </w:r>
-      <w:r>
-        <w:rPr>
-          <w:rFonts w:ascii="Arial" w:cs="Arial" w:eastAsia="Arial" w:hAnsi="Arial"/>
-          <w:sz w:val="20"/>
-          <w:szCs w:val="20"/>
-        </w:rPr>
-        <w:t xml:space="preserve">RECI</w:t>
-      </w:r>
-    </w:p>
-    <w:p>
-      <w:pPr>
-        <w:spacing w:after="30" w:line="260"/>
-        <w:ind w:left="200"/>
-      </w:pPr>
-      <w:r>
-        <w:rPr>
-          <w:rFonts w:ascii="Arial" w:cs="Arial" w:eastAsia="Arial" w:hAnsi="Arial"/>
-          <w:color w:val="1B2A30"/>
-          <w:sz w:val="22"/>
-          <w:szCs w:val="22"/>
-        </w:rPr>
-        <w:t xml:space="preserve">☐   </w:t>
-      </w:r>
-      <w:r>
-        <w:rPr>
-          <w:rFonts w:ascii="Arial" w:cs="Arial" w:eastAsia="Arial" w:hAnsi="Arial"/>
-          <w:sz w:val="20"/>
-          <w:szCs w:val="20"/>
-        </w:rPr>
-        <w:t xml:space="preserve">Part P registered</w:t>
-      </w:r>
-    </w:p>
-    <w:p>
-      <w:pPr>
-        <w:spacing w:after="30" w:line="260"/>
-        <w:ind w:left="200"/>
-      </w:pPr>
-      <w:r>
-        <w:rPr>
-          <w:rFonts w:ascii="Arial" w:cs="Arial" w:eastAsia="Arial" w:hAnsi="Arial"/>
-          <w:color w:val="1B2A30"/>
-          <w:sz w:val="22"/>
-          <w:szCs w:val="22"/>
-        </w:rPr>
-        <w:t xml:space="preserve">☐   </w:t>
-      </w:r>
-      <w:r>
-        <w:rPr>
-          <w:rFonts w:ascii="Arial" w:cs="Arial" w:eastAsia="Arial" w:hAnsi="Arial"/>
-          <w:sz w:val="20"/>
-          <w:szCs w:val="20"/>
-        </w:rPr>
-        <w:t xml:space="preserve">Master Electricians</w:t>
+        <w:t xml:space="preserve">Master Electricians Australia</w:t>
       </w:r>
     </w:p>
     <w:p>
@@ -1361,122 +1240,53 @@
           <w:sz w:val="20"/>
           <w:szCs w:val="20"/>
         </w:rPr>
-        <w:t xml:space="preserve">IBEW</w:t>
-      </w:r>
-    </w:p>
-    <w:p>
-      <w:pPr>
-        <w:spacing w:after="30" w:line="260"/>
-        <w:ind w:left="200"/>
-      </w:pPr>
-      <w:r>
-        <w:rPr>
-          <w:rFonts w:ascii="Arial" w:cs="Arial" w:eastAsia="Arial" w:hAnsi="Arial"/>
-          <w:color w:val="1B2A30"/>
-          <w:sz w:val="22"/>
-          <w:szCs w:val="22"/>
-        </w:rPr>
-        <w:t xml:space="preserve">☐   </w:t>
-      </w:r>
-      <w:r>
-        <w:rPr>
-          <w:rFonts w:ascii="Arial" w:cs="Arial" w:eastAsia="Arial" w:hAnsi="Arial"/>
-          <w:sz w:val="20"/>
-          <w:szCs w:val="20"/>
-        </w:rPr>
-        <w:t xml:space="preserve">TrustMark</w:t>
-      </w:r>
-    </w:p>
-    <w:p>
-      <w:pPr>
-        <w:spacing w:after="30" w:line="260"/>
-        <w:ind w:left="200"/>
-      </w:pPr>
-      <w:r>
-        <w:rPr>
-          <w:rFonts w:ascii="Arial" w:cs="Arial" w:eastAsia="Arial" w:hAnsi="Arial"/>
-          <w:color w:val="1B2A30"/>
-          <w:sz w:val="22"/>
-          <w:szCs w:val="22"/>
-        </w:rPr>
-        <w:t xml:space="preserve">☐   </w:t>
-      </w:r>
-      <w:r>
-        <w:rPr>
-          <w:rFonts w:ascii="Arial" w:cs="Arial" w:eastAsia="Arial" w:hAnsi="Arial"/>
-          <w:sz w:val="20"/>
-          <w:szCs w:val="20"/>
-        </w:rPr>
-        <w:t xml:space="preserve">Which? Trusted Trader</w:t>
-      </w:r>
-    </w:p>
-    <w:p>
-      <w:pPr>
-        <w:spacing w:after="30" w:line="260"/>
-        <w:ind w:left="200"/>
-      </w:pPr>
-      <w:r>
-        <w:rPr>
-          <w:rFonts w:ascii="Arial" w:cs="Arial" w:eastAsia="Arial" w:hAnsi="Arial"/>
-          <w:color w:val="1B2A30"/>
-          <w:sz w:val="22"/>
-          <w:szCs w:val="22"/>
-        </w:rPr>
-        <w:t xml:space="preserve">☐   </w:t>
-      </w:r>
-      <w:r>
-        <w:rPr>
-          <w:rFonts w:ascii="Arial" w:cs="Arial" w:eastAsia="Arial" w:hAnsi="Arial"/>
-          <w:sz w:val="20"/>
-          <w:szCs w:val="20"/>
-        </w:rPr>
-        <w:t xml:space="preserve">SafeContractor</w:t>
-      </w:r>
-    </w:p>
-    <w:p>
-      <w:pPr>
-        <w:spacing w:after="30" w:line="260"/>
-        <w:ind w:left="200"/>
-      </w:pPr>
-      <w:r>
-        <w:rPr>
-          <w:rFonts w:ascii="Arial" w:cs="Arial" w:eastAsia="Arial" w:hAnsi="Arial"/>
-          <w:color w:val="1B2A30"/>
-          <w:sz w:val="22"/>
-          <w:szCs w:val="22"/>
-        </w:rPr>
-        <w:t xml:space="preserve">☐   </w:t>
-      </w:r>
-      <w:r>
-        <w:rPr>
-          <w:rFonts w:ascii="Arial" w:cs="Arial" w:eastAsia="Arial" w:hAnsi="Arial"/>
-          <w:sz w:val="20"/>
-          <w:szCs w:val="20"/>
-        </w:rPr>
-        <w:t xml:space="preserve">CHAS</w:t>
-      </w:r>
-    </w:p>
-    <w:p>
-      <w:pPr>
-        <w:spacing w:after="30" w:line="260"/>
-        <w:ind w:left="200"/>
-      </w:pPr>
-      <w:r>
-        <w:rPr>
-          <w:rFonts w:ascii="Arial" w:cs="Arial" w:eastAsia="Arial" w:hAnsi="Arial"/>
-          <w:color w:val="1B2A30"/>
-          <w:sz w:val="22"/>
-          <w:szCs w:val="22"/>
-        </w:rPr>
-        <w:t xml:space="preserve">☐   </w:t>
-      </w:r>
-      <w:r>
-        <w:rPr>
-          <w:rFonts w:ascii="Arial" w:cs="Arial" w:eastAsia="Arial" w:hAnsi="Arial"/>
-          <w:sz w:val="20"/>
-          <w:szCs w:val="20"/>
-        </w:rPr>
-        <w:t xml:space="preserve">Constructionline</w:t>
+        <w:t xml:space="preserve">Solar installer accreditation (SAA / CEC)</w:t>
+      </w:r>
+    </w:p>
+    <w:p>
+      <w:pPr>
+        <w:spacing w:after="30" w:line="260"/>
+        <w:ind w:left="200"/>
+      </w:pPr>
+      <w:r>
+        <w:rPr>
+          <w:rFonts w:ascii="Arial" w:cs="Arial" w:eastAsia="Arial" w:hAnsi="Arial"/>
+          <w:color w:val="1B2A30"/>
+          <w:sz w:val="22"/>
+          <w:szCs w:val="22"/>
+        </w:rPr>
+        <w:t xml:space="preserve">☐   </w:t>
+      </w:r>
+      <w:r>
+        <w:rPr>
+          <w:rFonts w:ascii="Arial" w:cs="Arial" w:eastAsia="Arial" w:hAnsi="Arial"/>
+          <w:sz w:val="20"/>
+          <w:szCs w:val="20"/>
+        </w:rPr>
+        <w:t xml:space="preserve">Housing Industry Association (HIA)</w:t>
+      </w:r>
+    </w:p>
+    <w:p>
+      <w:pPr>
+        <w:spacing w:after="30" w:line="260"/>
+        <w:ind w:left="200"/>
+      </w:pPr>
+      <w:r>
+        <w:rPr>
+          <w:rFonts w:ascii="Arial" w:cs="Arial" w:eastAsia="Arial" w:hAnsi="Arial"/>
+          <w:color w:val="1B2A30"/>
+          <w:sz w:val="22"/>
+          <w:szCs w:val="22"/>
+        </w:rPr>
+        <w:t xml:space="preserve">☐   </w:t>
+      </w:r>
+      <w:r>
+        <w:rPr>
+          <w:rFonts w:ascii="Arial" w:cs="Arial" w:eastAsia="Arial" w:hAnsi="Arial"/>
+          <w:sz w:val="20"/>
+          <w:szCs w:val="20"/>
+        </w:rPr>
+        <w:t xml:space="preserve">Master Builders Victoria</w:t>
       </w:r>
     </w:p>
     <w:p>
@@ -1606,122 +1416,122 @@
           <w:sz w:val="20"/>
           <w:szCs w:val="20"/>
         </w:rPr>
-        <w:t xml:space="preserve">18th Edition (BS 7671)</w:t>
-      </w:r>
-    </w:p>
-    <w:p>
-      <w:pPr>
-        <w:spacing w:after="30" w:line="260"/>
-        <w:ind w:left="200"/>
-      </w:pPr>
-      <w:r>
-        <w:rPr>
-          <w:rFonts w:ascii="Arial" w:cs="Arial" w:eastAsia="Arial" w:hAnsi="Arial"/>
-          <w:color w:val="1B2A30"/>
-          <w:sz w:val="22"/>
-          <w:szCs w:val="22"/>
-        </w:rPr>
-        <w:t xml:space="preserve">☐   </w:t>
-      </w:r>
-      <w:r>
-        <w:rPr>
-          <w:rFonts w:ascii="Arial" w:cs="Arial" w:eastAsia="Arial" w:hAnsi="Arial"/>
-          <w:sz w:val="20"/>
-          <w:szCs w:val="20"/>
-        </w:rPr>
-        <w:t xml:space="preserve">C&amp;G 2391 inspection &amp; testing</w:t>
-      </w:r>
-    </w:p>
-    <w:p>
-      <w:pPr>
-        <w:spacing w:after="30" w:line="260"/>
-        <w:ind w:left="200"/>
-      </w:pPr>
-      <w:r>
-        <w:rPr>
-          <w:rFonts w:ascii="Arial" w:cs="Arial" w:eastAsia="Arial" w:hAnsi="Arial"/>
-          <w:color w:val="1B2A30"/>
-          <w:sz w:val="22"/>
-          <w:szCs w:val="22"/>
-        </w:rPr>
-        <w:t xml:space="preserve">☐   </w:t>
-      </w:r>
-      <w:r>
-        <w:rPr>
-          <w:rFonts w:ascii="Arial" w:cs="Arial" w:eastAsia="Arial" w:hAnsi="Arial"/>
-          <w:sz w:val="20"/>
-          <w:szCs w:val="20"/>
-        </w:rPr>
-        <w:t xml:space="preserve">C&amp;G 2919 EV charging</w:t>
-      </w:r>
-    </w:p>
-    <w:p>
-      <w:pPr>
-        <w:spacing w:after="30" w:line="260"/>
-        <w:ind w:left="200"/>
-      </w:pPr>
-      <w:r>
-        <w:rPr>
-          <w:rFonts w:ascii="Arial" w:cs="Arial" w:eastAsia="Arial" w:hAnsi="Arial"/>
-          <w:color w:val="1B2A30"/>
-          <w:sz w:val="22"/>
-          <w:szCs w:val="22"/>
-        </w:rPr>
-        <w:t xml:space="preserve">☐   </w:t>
-      </w:r>
-      <w:r>
-        <w:rPr>
-          <w:rFonts w:ascii="Arial" w:cs="Arial" w:eastAsia="Arial" w:hAnsi="Arial"/>
-          <w:sz w:val="20"/>
-          <w:szCs w:val="20"/>
-        </w:rPr>
-        <w:t xml:space="preserve">NVQ Level 3</w:t>
-      </w:r>
-    </w:p>
-    <w:p>
-      <w:pPr>
-        <w:spacing w:after="30" w:line="260"/>
-        <w:ind w:left="200"/>
-      </w:pPr>
-      <w:r>
-        <w:rPr>
-          <w:rFonts w:ascii="Arial" w:cs="Arial" w:eastAsia="Arial" w:hAnsi="Arial"/>
-          <w:color w:val="1B2A30"/>
-          <w:sz w:val="22"/>
-          <w:szCs w:val="22"/>
-        </w:rPr>
-        <w:t xml:space="preserve">☐   </w:t>
-      </w:r>
-      <w:r>
-        <w:rPr>
-          <w:rFonts w:ascii="Arial" w:cs="Arial" w:eastAsia="Arial" w:hAnsi="Arial"/>
-          <w:sz w:val="20"/>
-          <w:szCs w:val="20"/>
-        </w:rPr>
-        <w:t xml:space="preserve">JIB / ECS Gold Card</w:t>
-      </w:r>
-    </w:p>
-    <w:p>
-      <w:pPr>
-        <w:spacing w:after="30" w:line="260"/>
-        <w:ind w:left="200"/>
-      </w:pPr>
-      <w:r>
-        <w:rPr>
-          <w:rFonts w:ascii="Arial" w:cs="Arial" w:eastAsia="Arial" w:hAnsi="Arial"/>
-          <w:color w:val="1B2A30"/>
-          <w:sz w:val="22"/>
-          <w:szCs w:val="22"/>
-        </w:rPr>
-        <w:t xml:space="preserve">☐   </w:t>
-      </w:r>
-      <w:r>
-        <w:rPr>
-          <w:rFonts w:ascii="Arial" w:cs="Arial" w:eastAsia="Arial" w:hAnsi="Arial"/>
-          <w:sz w:val="20"/>
-          <w:szCs w:val="20"/>
-        </w:rPr>
-        <w:t xml:space="preserve">MCS solar PV</w:t>
+        <w:t xml:space="preserve">A-grade electrician's licence</w:t>
+      </w:r>
+    </w:p>
+    <w:p>
+      <w:pPr>
+        <w:spacing w:after="30" w:line="260"/>
+        <w:ind w:left="200"/>
+      </w:pPr>
+      <w:r>
+        <w:rPr>
+          <w:rFonts w:ascii="Arial" w:cs="Arial" w:eastAsia="Arial" w:hAnsi="Arial"/>
+          <w:color w:val="1B2A30"/>
+          <w:sz w:val="22"/>
+          <w:szCs w:val="22"/>
+        </w:rPr>
+        <w:t xml:space="preserve">☐   </w:t>
+      </w:r>
+      <w:r>
+        <w:rPr>
+          <w:rFonts w:ascii="Arial" w:cs="Arial" w:eastAsia="Arial" w:hAnsi="Arial"/>
+          <w:sz w:val="20"/>
+          <w:szCs w:val="20"/>
+        </w:rPr>
+        <w:t xml:space="preserve">Licensed Electrical Inspector (LEI)</w:t>
+      </w:r>
+    </w:p>
+    <w:p>
+      <w:pPr>
+        <w:spacing w:after="30" w:line="260"/>
+        <w:ind w:left="200"/>
+      </w:pPr>
+      <w:r>
+        <w:rPr>
+          <w:rFonts w:ascii="Arial" w:cs="Arial" w:eastAsia="Arial" w:hAnsi="Arial"/>
+          <w:color w:val="1B2A30"/>
+          <w:sz w:val="22"/>
+          <w:szCs w:val="22"/>
+        </w:rPr>
+        <w:t xml:space="preserve">☐   </w:t>
+      </w:r>
+      <w:r>
+        <w:rPr>
+          <w:rFonts w:ascii="Arial" w:cs="Arial" w:eastAsia="Arial" w:hAnsi="Arial"/>
+          <w:sz w:val="20"/>
+          <w:szCs w:val="20"/>
+        </w:rPr>
+        <w:t xml:space="preserve">Solar &amp; battery installer accreditation</w:t>
+      </w:r>
+    </w:p>
+    <w:p>
+      <w:pPr>
+        <w:spacing w:after="30" w:line="260"/>
+        <w:ind w:left="200"/>
+      </w:pPr>
+      <w:r>
+        <w:rPr>
+          <w:rFonts w:ascii="Arial" w:cs="Arial" w:eastAsia="Arial" w:hAnsi="Arial"/>
+          <w:color w:val="1B2A30"/>
+          <w:sz w:val="22"/>
+          <w:szCs w:val="22"/>
+        </w:rPr>
+        <w:t xml:space="preserve">☐   </w:t>
+      </w:r>
+      <w:r>
+        <w:rPr>
+          <w:rFonts w:ascii="Arial" w:cs="Arial" w:eastAsia="Arial" w:hAnsi="Arial"/>
+          <w:sz w:val="20"/>
+          <w:szCs w:val="20"/>
+        </w:rPr>
+        <w:t xml:space="preserve">EV charger manufacturer training</w:t>
+      </w:r>
+    </w:p>
+    <w:p>
+      <w:pPr>
+        <w:spacing w:after="30" w:line="260"/>
+        <w:ind w:left="200"/>
+      </w:pPr>
+      <w:r>
+        <w:rPr>
+          <w:rFonts w:ascii="Arial" w:cs="Arial" w:eastAsia="Arial" w:hAnsi="Arial"/>
+          <w:color w:val="1B2A30"/>
+          <w:sz w:val="22"/>
+          <w:szCs w:val="22"/>
+        </w:rPr>
+        <w:t xml:space="preserve">☐   </w:t>
+      </w:r>
+      <w:r>
+        <w:rPr>
+          <w:rFonts w:ascii="Arial" w:cs="Arial" w:eastAsia="Arial" w:hAnsi="Arial"/>
+          <w:sz w:val="20"/>
+          <w:szCs w:val="20"/>
+        </w:rPr>
+        <w:t xml:space="preserve">Registered cabler (data &amp; phone)</w:t>
+      </w:r>
+    </w:p>
+    <w:p>
+      <w:pPr>
+        <w:spacing w:after="30" w:line="260"/>
+        <w:ind w:left="200"/>
+      </w:pPr>
+      <w:r>
+        <w:rPr>
+          <w:rFonts w:ascii="Arial" w:cs="Arial" w:eastAsia="Arial" w:hAnsi="Arial"/>
+          <w:color w:val="1B2A30"/>
+          <w:sz w:val="22"/>
+          <w:szCs w:val="22"/>
+        </w:rPr>
+        <w:t xml:space="preserve">☐   </w:t>
+      </w:r>
+      <w:r>
+        <w:rPr>
+          <w:rFonts w:ascii="Arial" w:cs="Arial" w:eastAsia="Arial" w:hAnsi="Arial"/>
+          <w:sz w:val="20"/>
+          <w:szCs w:val="20"/>
+        </w:rPr>
+        <w:t xml:space="preserve">Refrigerant handling licence (ARCtick)</w:t>
       </w:r>
     </w:p>
     <w:p>
@@ -1808,7 +1618,7 @@
           <w:sz w:val="17"/>
           <w:szCs w:val="17"/>
         </w:rPr>
-        <w:t xml:space="preserve">e.g. £5m, Aviva</w:t>
+        <w:t xml:space="preserve">e.g. $20m, CGU</w:t>
       </w:r>
     </w:p>
     <w:p>
@@ -1825,7 +1635,7 @@
           <w:sz w:val="21"/>
           <w:szCs w:val="21"/>
         </w:rPr>
-        <w:t xml:space="preserve">Employers' liability — cover amount and insurer</w:t>
+        <w:t xml:space="preserve">WorkCover (WorkSafe Victoria) — if you employ staff</w:t>
       </w:r>
     </w:p>
     <w:p>
@@ -1899,7 +1709,7 @@
           <w:sz w:val="21"/>
           <w:szCs w:val="21"/>
         </w:rPr>
-        <w:t xml:space="preserve">Site tickets and safety cards</w:t>
+        <w:t xml:space="preserve">Tickets and safety training</w:t>
       </w:r>
     </w:p>
     <w:p>
@@ -1939,53 +1749,30 @@
           <w:sz w:val="20"/>
           <w:szCs w:val="20"/>
         </w:rPr>
-        <w:t xml:space="preserve">CSCS / ECS card</w:t>
-      </w:r>
-    </w:p>
-    <w:p>
-      <w:pPr>
-        <w:spacing w:after="30" w:line="260"/>
-        <w:ind w:left="200"/>
-      </w:pPr>
-      <w:r>
-        <w:rPr>
-          <w:rFonts w:ascii="Arial" w:cs="Arial" w:eastAsia="Arial" w:hAnsi="Arial"/>
-          <w:color w:val="1B2A30"/>
-          <w:sz w:val="22"/>
-          <w:szCs w:val="22"/>
-        </w:rPr>
-        <w:t xml:space="preserve">☐   </w:t>
-      </w:r>
-      <w:r>
-        <w:rPr>
-          <w:rFonts w:ascii="Arial" w:cs="Arial" w:eastAsia="Arial" w:hAnsi="Arial"/>
-          <w:sz w:val="20"/>
-          <w:szCs w:val="20"/>
-        </w:rPr>
-        <w:t xml:space="preserve">IPAF</w:t>
-      </w:r>
-    </w:p>
-    <w:p>
-      <w:pPr>
-        <w:spacing w:after="30" w:line="260"/>
-        <w:ind w:left="200"/>
-      </w:pPr>
-      <w:r>
-        <w:rPr>
-          <w:rFonts w:ascii="Arial" w:cs="Arial" w:eastAsia="Arial" w:hAnsi="Arial"/>
-          <w:color w:val="1B2A30"/>
-          <w:sz w:val="22"/>
-          <w:szCs w:val="22"/>
-        </w:rPr>
-        <w:t xml:space="preserve">☐   </w:t>
-      </w:r>
-      <w:r>
-        <w:rPr>
-          <w:rFonts w:ascii="Arial" w:cs="Arial" w:eastAsia="Arial" w:hAnsi="Arial"/>
-          <w:sz w:val="20"/>
-          <w:szCs w:val="20"/>
-        </w:rPr>
-        <w:t xml:space="preserve">PASMA</w:t>
+        <w:t xml:space="preserve">White Card (construction induction)</w:t>
+      </w:r>
+    </w:p>
+    <w:p>
+      <w:pPr>
+        <w:spacing w:after="30" w:line="260"/>
+        <w:ind w:left="200"/>
+      </w:pPr>
+      <w:r>
+        <w:rPr>
+          <w:rFonts w:ascii="Arial" w:cs="Arial" w:eastAsia="Arial" w:hAnsi="Arial"/>
+          <w:color w:val="1B2A30"/>
+          <w:sz w:val="22"/>
+          <w:szCs w:val="22"/>
+        </w:rPr>
+        <w:t xml:space="preserve">☐   </w:t>
+      </w:r>
+      <w:r>
+        <w:rPr>
+          <w:rFonts w:ascii="Arial" w:cs="Arial" w:eastAsia="Arial" w:hAnsi="Arial"/>
+          <w:sz w:val="20"/>
+          <w:szCs w:val="20"/>
+        </w:rPr>
+        <w:t xml:space="preserve">EWP licence</w:t>
       </w:r>
     </w:p>
     <w:p>
@@ -2077,30 +1864,53 @@
           <w:sz w:val="20"/>
           <w:szCs w:val="20"/>
         </w:rPr>
-        <w:t xml:space="preserve">First aid</w:t>
-      </w:r>
-    </w:p>
-    <w:p>
-      <w:pPr>
-        <w:spacing w:after="30" w:line="260"/>
-        <w:ind w:left="200"/>
-      </w:pPr>
-      <w:r>
-        <w:rPr>
-          <w:rFonts w:ascii="Arial" w:cs="Arial" w:eastAsia="Arial" w:hAnsi="Arial"/>
-          <w:color w:val="1B2A30"/>
-          <w:sz w:val="22"/>
-          <w:szCs w:val="22"/>
-        </w:rPr>
-        <w:t xml:space="preserve">☐   </w:t>
-      </w:r>
-      <w:r>
-        <w:rPr>
-          <w:rFonts w:ascii="Arial" w:cs="Arial" w:eastAsia="Arial" w:hAnsi="Arial"/>
-          <w:sz w:val="20"/>
-          <w:szCs w:val="20"/>
-        </w:rPr>
-        <w:t xml:space="preserve">Manual handling</w:t>
+        <w:t xml:space="preserve">First aid / CPR</w:t>
+      </w:r>
+    </w:p>
+    <w:p>
+      <w:pPr>
+        <w:spacing w:after="30" w:line="260"/>
+        <w:ind w:left="200"/>
+      </w:pPr>
+      <w:r>
+        <w:rPr>
+          <w:rFonts w:ascii="Arial" w:cs="Arial" w:eastAsia="Arial" w:hAnsi="Arial"/>
+          <w:color w:val="1B2A30"/>
+          <w:sz w:val="22"/>
+          <w:szCs w:val="22"/>
+        </w:rPr>
+        <w:t xml:space="preserve">☐   </w:t>
+      </w:r>
+      <w:r>
+        <w:rPr>
+          <w:rFonts w:ascii="Arial" w:cs="Arial" w:eastAsia="Arial" w:hAnsi="Arial"/>
+          <w:sz w:val="20"/>
+          <w:szCs w:val="20"/>
+        </w:rPr>
+        <w:t xml:space="preserve">Low voltage rescue (LVR)</w:t>
+      </w:r>
+    </w:p>
+    <w:p>
+      <w:pPr>
+        <w:spacing w:after="30" w:line="260"/>
+        <w:ind w:left="200"/>
+      </w:pPr>
+      <w:r>
+        <w:rPr>
+          <w:rFonts w:ascii="Arial" w:cs="Arial" w:eastAsia="Arial" w:hAnsi="Arial"/>
+          <w:color w:val="1B2A30"/>
+          <w:sz w:val="22"/>
+          <w:szCs w:val="22"/>
+        </w:rPr>
+        <w:t xml:space="preserve">☐   </w:t>
+      </w:r>
+      <w:r>
+        <w:rPr>
+          <w:rFonts w:ascii="Arial" w:cs="Arial" w:eastAsia="Arial" w:hAnsi="Arial"/>
+          <w:sz w:val="20"/>
+          <w:szCs w:val="20"/>
+        </w:rPr>
+        <w:t xml:space="preserve">Test &amp; tag</w:t>
       </w:r>
     </w:p>
     <w:p>
@@ -2256,76 +2066,76 @@
           <w:sz w:val="20"/>
           <w:szCs w:val="20"/>
         </w:rPr>
-        <w:t xml:space="preserve">Consumer unit / fuse board upgrades</w:t>
-      </w:r>
-    </w:p>
-    <w:p>
-      <w:pPr>
-        <w:spacing w:after="30" w:line="260"/>
-        <w:ind w:left="200"/>
-      </w:pPr>
-      <w:r>
-        <w:rPr>
-          <w:rFonts w:ascii="Arial" w:cs="Arial" w:eastAsia="Arial" w:hAnsi="Arial"/>
-          <w:color w:val="1B2A30"/>
-          <w:sz w:val="22"/>
-          <w:szCs w:val="22"/>
-        </w:rPr>
-        <w:t xml:space="preserve">☐   </w:t>
-      </w:r>
-      <w:r>
-        <w:rPr>
-          <w:rFonts w:ascii="Arial" w:cs="Arial" w:eastAsia="Arial" w:hAnsi="Arial"/>
-          <w:sz w:val="20"/>
-          <w:szCs w:val="20"/>
-        </w:rPr>
-        <w:t xml:space="preserve">EICR inspection &amp; testing</w:t>
-      </w:r>
-    </w:p>
-    <w:p>
-      <w:pPr>
-        <w:spacing w:after="30" w:line="260"/>
-        <w:ind w:left="200"/>
-      </w:pPr>
-      <w:r>
-        <w:rPr>
-          <w:rFonts w:ascii="Arial" w:cs="Arial" w:eastAsia="Arial" w:hAnsi="Arial"/>
-          <w:color w:val="1B2A30"/>
-          <w:sz w:val="22"/>
-          <w:szCs w:val="22"/>
-        </w:rPr>
-        <w:t xml:space="preserve">☐   </w:t>
-      </w:r>
-      <w:r>
-        <w:rPr>
-          <w:rFonts w:ascii="Arial" w:cs="Arial" w:eastAsia="Arial" w:hAnsi="Arial"/>
-          <w:sz w:val="20"/>
-          <w:szCs w:val="20"/>
-        </w:rPr>
-        <w:t xml:space="preserve">Landlord certificates</w:t>
-      </w:r>
-    </w:p>
-    <w:p>
-      <w:pPr>
-        <w:spacing w:after="30" w:line="260"/>
-        <w:ind w:left="200"/>
-      </w:pPr>
-      <w:r>
-        <w:rPr>
-          <w:rFonts w:ascii="Arial" w:cs="Arial" w:eastAsia="Arial" w:hAnsi="Arial"/>
-          <w:color w:val="1B2A30"/>
-          <w:sz w:val="22"/>
-          <w:szCs w:val="22"/>
-        </w:rPr>
-        <w:t xml:space="preserve">☐   </w:t>
-      </w:r>
-      <w:r>
-        <w:rPr>
-          <w:rFonts w:ascii="Arial" w:cs="Arial" w:eastAsia="Arial" w:hAnsi="Arial"/>
-          <w:sz w:val="20"/>
-          <w:szCs w:val="20"/>
-        </w:rPr>
-        <w:t xml:space="preserve">PAT testing</w:t>
+        <w:t xml:space="preserve">Switchboard upgrades</w:t>
+      </w:r>
+    </w:p>
+    <w:p>
+      <w:pPr>
+        <w:spacing w:after="30" w:line="260"/>
+        <w:ind w:left="200"/>
+      </w:pPr>
+      <w:r>
+        <w:rPr>
+          <w:rFonts w:ascii="Arial" w:cs="Arial" w:eastAsia="Arial" w:hAnsi="Arial"/>
+          <w:color w:val="1B2A30"/>
+          <w:sz w:val="22"/>
+          <w:szCs w:val="22"/>
+        </w:rPr>
+        <w:t xml:space="preserve">☐   </w:t>
+      </w:r>
+      <w:r>
+        <w:rPr>
+          <w:rFonts w:ascii="Arial" w:cs="Arial" w:eastAsia="Arial" w:hAnsi="Arial"/>
+          <w:sz w:val="20"/>
+          <w:szCs w:val="20"/>
+        </w:rPr>
+        <w:t xml:space="preserve">Safety switch (RCD) installation</w:t>
+      </w:r>
+    </w:p>
+    <w:p>
+      <w:pPr>
+        <w:spacing w:after="30" w:line="260"/>
+        <w:ind w:left="200"/>
+      </w:pPr>
+      <w:r>
+        <w:rPr>
+          <w:rFonts w:ascii="Arial" w:cs="Arial" w:eastAsia="Arial" w:hAnsi="Arial"/>
+          <w:color w:val="1B2A30"/>
+          <w:sz w:val="22"/>
+          <w:szCs w:val="22"/>
+        </w:rPr>
+        <w:t xml:space="preserve">☐   </w:t>
+      </w:r>
+      <w:r>
+        <w:rPr>
+          <w:rFonts w:ascii="Arial" w:cs="Arial" w:eastAsia="Arial" w:hAnsi="Arial"/>
+          <w:sz w:val="20"/>
+          <w:szCs w:val="20"/>
+        </w:rPr>
+        <w:t xml:space="preserve">Rental electrical safety checks</w:t>
+      </w:r>
+    </w:p>
+    <w:p>
+      <w:pPr>
+        <w:spacing w:after="30" w:line="260"/>
+        <w:ind w:left="200"/>
+      </w:pPr>
+      <w:r>
+        <w:rPr>
+          <w:rFonts w:ascii="Arial" w:cs="Arial" w:eastAsia="Arial" w:hAnsi="Arial"/>
+          <w:color w:val="1B2A30"/>
+          <w:sz w:val="22"/>
+          <w:szCs w:val="22"/>
+        </w:rPr>
+        <w:t xml:space="preserve">☐   </w:t>
+      </w:r>
+      <w:r>
+        <w:rPr>
+          <w:rFonts w:ascii="Arial" w:cs="Arial" w:eastAsia="Arial" w:hAnsi="Arial"/>
+          <w:sz w:val="20"/>
+          <w:szCs w:val="20"/>
+        </w:rPr>
+        <w:t xml:space="preserve">Pre-purchase electrical inspections</w:t>
       </w:r>
     </w:p>
     <w:p>
@@ -2371,30 +2181,30 @@
           <w:sz w:val="20"/>
           <w:szCs w:val="20"/>
         </w:rPr>
-        <w:t xml:space="preserve">Sockets &amp; switches</w:t>
-      </w:r>
-    </w:p>
-    <w:p>
-      <w:pPr>
-        <w:spacing w:after="30" w:line="260"/>
-        <w:ind w:left="200"/>
-      </w:pPr>
-      <w:r>
-        <w:rPr>
-          <w:rFonts w:ascii="Arial" w:cs="Arial" w:eastAsia="Arial" w:hAnsi="Arial"/>
-          <w:color w:val="1B2A30"/>
-          <w:sz w:val="22"/>
-          <w:szCs w:val="22"/>
-        </w:rPr>
-        <w:t xml:space="preserve">☐   </w:t>
-      </w:r>
-      <w:r>
-        <w:rPr>
-          <w:rFonts w:ascii="Arial" w:cs="Arial" w:eastAsia="Arial" w:hAnsi="Arial"/>
-          <w:sz w:val="20"/>
-          <w:szCs w:val="20"/>
-        </w:rPr>
-        <w:t xml:space="preserve">Indoor lighting design</w:t>
+        <w:t xml:space="preserve">Power points &amp; USB outlets</w:t>
+      </w:r>
+    </w:p>
+    <w:p>
+      <w:pPr>
+        <w:spacing w:after="30" w:line="260"/>
+        <w:ind w:left="200"/>
+      </w:pPr>
+      <w:r>
+        <w:rPr>
+          <w:rFonts w:ascii="Arial" w:cs="Arial" w:eastAsia="Arial" w:hAnsi="Arial"/>
+          <w:color w:val="1B2A30"/>
+          <w:sz w:val="22"/>
+          <w:szCs w:val="22"/>
+        </w:rPr>
+        <w:t xml:space="preserve">☐   </w:t>
+      </w:r>
+      <w:r>
+        <w:rPr>
+          <w:rFonts w:ascii="Arial" w:cs="Arial" w:eastAsia="Arial" w:hAnsi="Arial"/>
+          <w:sz w:val="20"/>
+          <w:szCs w:val="20"/>
+        </w:rPr>
+        <w:t xml:space="preserve">Indoor lighting &amp; downlights</w:t>
       </w:r>
     </w:p>
     <w:p>
@@ -2463,7 +2273,7 @@
           <w:sz w:val="20"/>
           <w:szCs w:val="20"/>
         </w:rPr>
-        <w:t xml:space="preserve">Solar PV &amp; battery storage</w:t>
+        <w:t xml:space="preserve">Solar &amp; battery storage</w:t>
       </w:r>
     </w:p>
     <w:p>
@@ -2532,7 +2342,7 @@
           <w:sz w:val="20"/>
           <w:szCs w:val="20"/>
         </w:rPr>
-        <w:t xml:space="preserve">Data &amp; network cabling</w:t>
+        <w:t xml:space="preserve">Data &amp; TV points</w:t>
       </w:r>
     </w:p>
     <w:p>
@@ -2578,99 +2388,99 @@
           <w:sz w:val="20"/>
           <w:szCs w:val="20"/>
         </w:rPr>
-        <w:t xml:space="preserve">Underfloor heating</w:t>
-      </w:r>
-    </w:p>
-    <w:p>
-      <w:pPr>
-        <w:spacing w:after="30" w:line="260"/>
-        <w:ind w:left="200"/>
-      </w:pPr>
-      <w:r>
-        <w:rPr>
-          <w:rFonts w:ascii="Arial" w:cs="Arial" w:eastAsia="Arial" w:hAnsi="Arial"/>
-          <w:color w:val="1B2A30"/>
-          <w:sz w:val="22"/>
-          <w:szCs w:val="22"/>
-        </w:rPr>
-        <w:t xml:space="preserve">☐   </w:t>
-      </w:r>
-      <w:r>
-        <w:rPr>
-          <w:rFonts w:ascii="Arial" w:cs="Arial" w:eastAsia="Arial" w:hAnsi="Arial"/>
-          <w:sz w:val="20"/>
-          <w:szCs w:val="20"/>
-        </w:rPr>
-        <w:t xml:space="preserve">Garage &amp; outbuilding supply</w:t>
-      </w:r>
-    </w:p>
-    <w:p>
-      <w:pPr>
-        <w:spacing w:after="30" w:line="260"/>
-        <w:ind w:left="200"/>
-      </w:pPr>
-      <w:r>
-        <w:rPr>
-          <w:rFonts w:ascii="Arial" w:cs="Arial" w:eastAsia="Arial" w:hAnsi="Arial"/>
-          <w:color w:val="1B2A30"/>
-          <w:sz w:val="22"/>
-          <w:szCs w:val="22"/>
-        </w:rPr>
-        <w:t xml:space="preserve">☐   </w:t>
-      </w:r>
-      <w:r>
-        <w:rPr>
-          <w:rFonts w:ascii="Arial" w:cs="Arial" w:eastAsia="Arial" w:hAnsi="Arial"/>
-          <w:sz w:val="20"/>
-          <w:szCs w:val="20"/>
-        </w:rPr>
-        <w:t xml:space="preserve">Hot tub supply</w:t>
-      </w:r>
-    </w:p>
-    <w:p>
-      <w:pPr>
-        <w:spacing w:after="30" w:line="260"/>
-        <w:ind w:left="200"/>
-      </w:pPr>
-      <w:r>
-        <w:rPr>
-          <w:rFonts w:ascii="Arial" w:cs="Arial" w:eastAsia="Arial" w:hAnsi="Arial"/>
-          <w:color w:val="1B2A30"/>
-          <w:sz w:val="22"/>
-          <w:szCs w:val="22"/>
-        </w:rPr>
-        <w:t xml:space="preserve">☐   </w:t>
-      </w:r>
-      <w:r>
-        <w:rPr>
-          <w:rFonts w:ascii="Arial" w:cs="Arial" w:eastAsia="Arial" w:hAnsi="Arial"/>
-          <w:sz w:val="20"/>
-          <w:szCs w:val="20"/>
-        </w:rPr>
-        <w:t xml:space="preserve">New build first &amp; second fix</w:t>
-      </w:r>
-    </w:p>
-    <w:p>
-      <w:pPr>
-        <w:spacing w:after="30" w:line="260"/>
-        <w:ind w:left="200"/>
-      </w:pPr>
-      <w:r>
-        <w:rPr>
-          <w:rFonts w:ascii="Arial" w:cs="Arial" w:eastAsia="Arial" w:hAnsi="Arial"/>
-          <w:color w:val="1B2A30"/>
-          <w:sz w:val="22"/>
-          <w:szCs w:val="22"/>
-        </w:rPr>
-        <w:t xml:space="preserve">☐   </w:t>
-      </w:r>
-      <w:r>
-        <w:rPr>
-          <w:rFonts w:ascii="Arial" w:cs="Arial" w:eastAsia="Arial" w:hAnsi="Arial"/>
-          <w:sz w:val="20"/>
-          <w:szCs w:val="20"/>
-        </w:rPr>
-        <w:t xml:space="preserve">Electric showers &amp; cookers</w:t>
+        <w:t xml:space="preserve">Split-system air-con (electrical side)</w:t>
+      </w:r>
+    </w:p>
+    <w:p>
+      <w:pPr>
+        <w:spacing w:after="30" w:line="260"/>
+        <w:ind w:left="200"/>
+      </w:pPr>
+      <w:r>
+        <w:rPr>
+          <w:rFonts w:ascii="Arial" w:cs="Arial" w:eastAsia="Arial" w:hAnsi="Arial"/>
+          <w:color w:val="1B2A30"/>
+          <w:sz w:val="22"/>
+          <w:szCs w:val="22"/>
+        </w:rPr>
+        <w:t xml:space="preserve">☐   </w:t>
+      </w:r>
+      <w:r>
+        <w:rPr>
+          <w:rFonts w:ascii="Arial" w:cs="Arial" w:eastAsia="Arial" w:hAnsi="Arial"/>
+          <w:sz w:val="20"/>
+          <w:szCs w:val="20"/>
+        </w:rPr>
+        <w:t xml:space="preserve">Ceiling &amp; exhaust fans</w:t>
+      </w:r>
+    </w:p>
+    <w:p>
+      <w:pPr>
+        <w:spacing w:after="30" w:line="260"/>
+        <w:ind w:left="200"/>
+      </w:pPr>
+      <w:r>
+        <w:rPr>
+          <w:rFonts w:ascii="Arial" w:cs="Arial" w:eastAsia="Arial" w:hAnsi="Arial"/>
+          <w:color w:val="1B2A30"/>
+          <w:sz w:val="22"/>
+          <w:szCs w:val="22"/>
+        </w:rPr>
+        <w:t xml:space="preserve">☐   </w:t>
+      </w:r>
+      <w:r>
+        <w:rPr>
+          <w:rFonts w:ascii="Arial" w:cs="Arial" w:eastAsia="Arial" w:hAnsi="Arial"/>
+          <w:sz w:val="20"/>
+          <w:szCs w:val="20"/>
+        </w:rPr>
+        <w:t xml:space="preserve">Smoke alarms</w:t>
+      </w:r>
+    </w:p>
+    <w:p>
+      <w:pPr>
+        <w:spacing w:after="30" w:line="260"/>
+        <w:ind w:left="200"/>
+      </w:pPr>
+      <w:r>
+        <w:rPr>
+          <w:rFonts w:ascii="Arial" w:cs="Arial" w:eastAsia="Arial" w:hAnsi="Arial"/>
+          <w:color w:val="1B2A30"/>
+          <w:sz w:val="22"/>
+          <w:szCs w:val="22"/>
+        </w:rPr>
+        <w:t xml:space="preserve">☐   </w:t>
+      </w:r>
+      <w:r>
+        <w:rPr>
+          <w:rFonts w:ascii="Arial" w:cs="Arial" w:eastAsia="Arial" w:hAnsi="Arial"/>
+          <w:sz w:val="20"/>
+          <w:szCs w:val="20"/>
+        </w:rPr>
+        <w:t xml:space="preserve">New builds &amp; extensions (rough-in &amp; fit-off)</w:t>
+      </w:r>
+    </w:p>
+    <w:p>
+      <w:pPr>
+        <w:spacing w:after="30" w:line="260"/>
+        <w:ind w:left="200"/>
+      </w:pPr>
+      <w:r>
+        <w:rPr>
+          <w:rFonts w:ascii="Arial" w:cs="Arial" w:eastAsia="Arial" w:hAnsi="Arial"/>
+          <w:color w:val="1B2A30"/>
+          <w:sz w:val="22"/>
+          <w:szCs w:val="22"/>
+        </w:rPr>
+        <w:t xml:space="preserve">☐   </w:t>
+      </w:r>
+      <w:r>
+        <w:rPr>
+          <w:rFonts w:ascii="Arial" w:cs="Arial" w:eastAsia="Arial" w:hAnsi="Arial"/>
+          <w:sz w:val="20"/>
+          <w:szCs w:val="20"/>
+        </w:rPr>
+        <w:t xml:space="preserve">Hot water systems &amp; cooktops</w:t>
       </w:r>
     </w:p>
     <w:p>
@@ -2723,7 +2533,7 @@
           <w:sz w:val="17"/>
           <w:szCs w:val="17"/>
         </w:rPr>
-        <w:t xml:space="preserve">e.g. Immersion heaters, extractor fans, doorbells and intercoms…</w:t>
+        <w:t xml:space="preserve">e.g. Pool pumps, doorbells and intercoms, sheds and granny flats…</w:t>
       </w:r>
     </w:p>
     <w:p>
@@ -2840,53 +2650,30 @@
           <w:sz w:val="20"/>
           <w:szCs w:val="20"/>
         </w:rPr>
-        <w:t xml:space="preserve">Commercial EICR</w:t>
-      </w:r>
-    </w:p>
-    <w:p>
-      <w:pPr>
-        <w:spacing w:after="30" w:line="260"/>
-        <w:ind w:left="200"/>
-      </w:pPr>
-      <w:r>
-        <w:rPr>
-          <w:rFonts w:ascii="Arial" w:cs="Arial" w:eastAsia="Arial" w:hAnsi="Arial"/>
-          <w:color w:val="1B2A30"/>
-          <w:sz w:val="22"/>
-          <w:szCs w:val="22"/>
-        </w:rPr>
-        <w:t xml:space="preserve">☐   </w:t>
-      </w:r>
-      <w:r>
-        <w:rPr>
-          <w:rFonts w:ascii="Arial" w:cs="Arial" w:eastAsia="Arial" w:hAnsi="Arial"/>
-          <w:sz w:val="20"/>
-          <w:szCs w:val="20"/>
-        </w:rPr>
-        <w:t xml:space="preserve">Fire alarm install &amp; testing</w:t>
-      </w:r>
-    </w:p>
-    <w:p>
-      <w:pPr>
-        <w:spacing w:after="30" w:line="260"/>
-        <w:ind w:left="200"/>
-      </w:pPr>
-      <w:r>
-        <w:rPr>
-          <w:rFonts w:ascii="Arial" w:cs="Arial" w:eastAsia="Arial" w:hAnsi="Arial"/>
-          <w:color w:val="1B2A30"/>
-          <w:sz w:val="22"/>
-          <w:szCs w:val="22"/>
-        </w:rPr>
-        <w:t xml:space="preserve">☐   </w:t>
-      </w:r>
-      <w:r>
-        <w:rPr>
-          <w:rFonts w:ascii="Arial" w:cs="Arial" w:eastAsia="Arial" w:hAnsi="Arial"/>
-          <w:sz w:val="20"/>
-          <w:szCs w:val="20"/>
-        </w:rPr>
-        <w:t xml:space="preserve">Emergency lighting</w:t>
+        <w:t xml:space="preserve">Commercial electrical inspections</w:t>
+      </w:r>
+    </w:p>
+    <w:p>
+      <w:pPr>
+        <w:spacing w:after="30" w:line="260"/>
+        <w:ind w:left="200"/>
+      </w:pPr>
+      <w:r>
+        <w:rPr>
+          <w:rFonts w:ascii="Arial" w:cs="Arial" w:eastAsia="Arial" w:hAnsi="Arial"/>
+          <w:color w:val="1B2A30"/>
+          <w:sz w:val="22"/>
+          <w:szCs w:val="22"/>
+        </w:rPr>
+        <w:t xml:space="preserve">☐   </w:t>
+      </w:r>
+      <w:r>
+        <w:rPr>
+          <w:rFonts w:ascii="Arial" w:cs="Arial" w:eastAsia="Arial" w:hAnsi="Arial"/>
+          <w:sz w:val="20"/>
+          <w:szCs w:val="20"/>
+        </w:rPr>
+        <w:t xml:space="preserve">Emergency &amp; exit lighting testing</w:t>
       </w:r>
     </w:p>
     <w:p>
@@ -2932,7 +2719,7 @@
           <w:sz w:val="20"/>
           <w:szCs w:val="20"/>
         </w:rPr>
-        <w:t xml:space="preserve">Shop &amp; office fit-out</w:t>
+        <w:t xml:space="preserve">Shop &amp; office fit-outs</w:t>
       </w:r>
     </w:p>
     <w:p>
@@ -3001,30 +2788,30 @@
           <w:sz w:val="20"/>
           <w:szCs w:val="20"/>
         </w:rPr>
-        <w:t xml:space="preserve">Data centre / comms rooms</w:t>
-      </w:r>
-    </w:p>
-    <w:p>
-      <w:pPr>
-        <w:spacing w:after="30" w:line="260"/>
-        <w:ind w:left="200"/>
-      </w:pPr>
-      <w:r>
-        <w:rPr>
-          <w:rFonts w:ascii="Arial" w:cs="Arial" w:eastAsia="Arial" w:hAnsi="Arial"/>
-          <w:color w:val="1B2A30"/>
-          <w:sz w:val="22"/>
-          <w:szCs w:val="22"/>
-        </w:rPr>
-        <w:t xml:space="preserve">☐   </w:t>
-      </w:r>
-      <w:r>
-        <w:rPr>
-          <w:rFonts w:ascii="Arial" w:cs="Arial" w:eastAsia="Arial" w:hAnsi="Arial"/>
-          <w:sz w:val="20"/>
-          <w:szCs w:val="20"/>
-        </w:rPr>
-        <w:t xml:space="preserve">Landlord &amp; agent contracts</w:t>
+        <w:t xml:space="preserve">Data &amp; comms rooms</w:t>
+      </w:r>
+    </w:p>
+    <w:p>
+      <w:pPr>
+        <w:spacing w:after="30" w:line="260"/>
+        <w:ind w:left="200"/>
+      </w:pPr>
+      <w:r>
+        <w:rPr>
+          <w:rFonts w:ascii="Arial" w:cs="Arial" w:eastAsia="Arial" w:hAnsi="Arial"/>
+          <w:color w:val="1B2A30"/>
+          <w:sz w:val="22"/>
+          <w:szCs w:val="22"/>
+        </w:rPr>
+        <w:t xml:space="preserve">☐   </w:t>
+      </w:r>
+      <w:r>
+        <w:rPr>
+          <w:rFonts w:ascii="Arial" w:cs="Arial" w:eastAsia="Arial" w:hAnsi="Arial"/>
+          <w:sz w:val="20"/>
+          <w:szCs w:val="20"/>
+        </w:rPr>
+        <w:t xml:space="preserve">Real estate &amp; property manager work</w:t>
       </w:r>
     </w:p>
     <w:p>
@@ -3070,7 +2857,30 @@
           <w:sz w:val="20"/>
           <w:szCs w:val="20"/>
         </w:rPr>
-        <w:t xml:space="preserve">Street &amp; car park lighting</w:t>
+        <w:t xml:space="preserve">Workplace test &amp; tag</w:t>
+      </w:r>
+    </w:p>
+    <w:p>
+      <w:pPr>
+        <w:spacing w:after="30" w:line="260"/>
+        <w:ind w:left="200"/>
+      </w:pPr>
+      <w:r>
+        <w:rPr>
+          <w:rFonts w:ascii="Arial" w:cs="Arial" w:eastAsia="Arial" w:hAnsi="Arial"/>
+          <w:color w:val="1B2A30"/>
+          <w:sz w:val="22"/>
+          <w:szCs w:val="22"/>
+        </w:rPr>
+        <w:t xml:space="preserve">☐   </w:t>
+      </w:r>
+      <w:r>
+        <w:rPr>
+          <w:rFonts w:ascii="Arial" w:cs="Arial" w:eastAsia="Arial" w:hAnsi="Arial"/>
+          <w:sz w:val="20"/>
+          <w:szCs w:val="20"/>
+        </w:rPr>
+        <w:t xml:space="preserve">Car park &amp; security lighting</w:t>
       </w:r>
     </w:p>
     <w:p>
@@ -3146,7 +2956,7 @@
           <w:sz w:val="17"/>
           <w:szCs w:val="17"/>
         </w:rPr>
-        <w:t xml:space="preserve">e.g. Shop-front signage supplies, refrigeration isolators, EV fleet charging…</w:t>
+        <w:t xml:space="preserve">e.g. Shop signage supplies, cool room isolators, EV fleet charging…</w:t>
       </w:r>
     </w:p>
     <w:p>
@@ -3257,9 +3067,9 @@
           <w:sz w:val="17"/>
           <w:szCs w:val="17"/>
         </w:rPr>
-        <w:t xml:space="preserve">e.g. 1. Consumer unit upgrades
+        <w:t xml:space="preserve">e.g. 1. Switchboard upgrades
 2. EV chargers
-3. Landlord EICRs
+3. Rental safety checks
 4. Full rewires</w:t>
       </w:r>
     </w:p>
@@ -3377,7 +3187,7 @@
           <w:sz w:val="17"/>
           <w:szCs w:val="17"/>
         </w:rPr>
-        <w:t xml:space="preserve">e.g. Anything with a hot tub. Appliance repairs. Jobs under £80.</w:t>
+        <w:t xml:space="preserve">e.g. Pool pumps. Appliance repairs. Jobs under $150.</w:t>
       </w:r>
     </w:p>
     <w:p>
@@ -3616,7 +3426,7 @@
           <w:sz w:val="17"/>
           <w:szCs w:val="17"/>
         </w:rPr>
-        <w:t xml:space="preserve">e.g. On site within 2 hours inside the ring road</w:t>
+        <w:t xml:space="preserve">e.g. On site within 2 hours across the south-east suburbs</w:t>
       </w:r>
     </w:p>
     <w:p>
@@ -3673,30 +3483,7 @@
           <w:sz w:val="20"/>
           <w:szCs w:val="20"/>
         </w:rPr>
-        <w:t xml:space="preserve">Grant-approved installer (OZEV or equivalent)</w:t>
-      </w:r>
-    </w:p>
-    <w:p>
-      <w:pPr>
-        <w:spacing w:after="30" w:line="260"/>
-        <w:ind w:left="200"/>
-      </w:pPr>
-      <w:r>
-        <w:rPr>
-          <w:rFonts w:ascii="Arial" w:cs="Arial" w:eastAsia="Arial" w:hAnsi="Arial"/>
-          <w:color w:val="1B2A30"/>
-          <w:sz w:val="22"/>
-          <w:szCs w:val="22"/>
-        </w:rPr>
-        <w:t xml:space="preserve">☐   </w:t>
-      </w:r>
-      <w:r>
-        <w:rPr>
-          <w:rFonts w:ascii="Arial" w:cs="Arial" w:eastAsia="Arial" w:hAnsi="Arial"/>
-          <w:sz w:val="20"/>
-          <w:szCs w:val="20"/>
-        </w:rPr>
-        <w:t xml:space="preserve">Manufacturer approved</w:t>
+        <w:t xml:space="preserve">Manufacturer approved / certified</w:t>
       </w:r>
     </w:p>
     <w:p>
@@ -3795,7 +3582,7 @@
           <w:sz w:val="17"/>
           <w:szCs w:val="17"/>
         </w:rPr>
-        <w:t xml:space="preserve">e.g. Zappi, Ohme, Tesla, GivEnergy, Hypervolt</w:t>
+        <w:t xml:space="preserve">e.g. Tesla, Zappi, Wallbox, Schneider, ABB</w:t>
       </w:r>
     </w:p>
     <w:p>
@@ -3898,10 +3685,10 @@
           <w:sz w:val="17"/>
           <w:szCs w:val="17"/>
         </w:rPr>
-        <w:t xml:space="preserve">e.g. electrician Solihull
-EV charger installer Birmingham
+        <w:t xml:space="preserve">e.g. electrician Dandenong
+EV charger installer Melbourne
 emergency electrician near me
-landlord EICR Shirley</w:t>
+rental safety check Berwick</w:t>
       </w:r>
     </w:p>
     <w:p>
@@ -4376,9 +4163,9 @@
           <w:sz w:val="17"/>
           <w:szCs w:val="17"/>
         </w:rPr>
-        <w:t xml:space="preserve">e.g. EICR, 3-bed house: £180
-Consumer unit change: £550
-EV charger, standard install: £899</w:t>
+        <w:t xml:space="preserve">e.g. Rental safety check: $180
+Switchboard upgrade: $1,800
+EV charger, standard install: $1,200</w:t>
       </w:r>
     </w:p>
     <w:p>
@@ -4703,30 +4490,30 @@
           <w:sz w:val="20"/>
           <w:szCs w:val="20"/>
         </w:rPr>
-        <w:t xml:space="preserve">Cheque</w:t>
-      </w:r>
-    </w:p>
-    <w:p>
-      <w:pPr>
-        <w:spacing w:after="30" w:line="260"/>
-        <w:ind w:left="200"/>
-      </w:pPr>
-      <w:r>
-        <w:rPr>
-          <w:rFonts w:ascii="Arial" w:cs="Arial" w:eastAsia="Arial" w:hAnsi="Arial"/>
-          <w:color w:val="1B2A30"/>
-          <w:sz w:val="22"/>
-          <w:szCs w:val="22"/>
-        </w:rPr>
-        <w:t xml:space="preserve">☐   </w:t>
-      </w:r>
-      <w:r>
-        <w:rPr>
-          <w:rFonts w:ascii="Arial" w:cs="Arial" w:eastAsia="Arial" w:hAnsi="Arial"/>
-          <w:sz w:val="20"/>
-          <w:szCs w:val="20"/>
-        </w:rPr>
         <w:t xml:space="preserve">Direct debit</w:t>
+      </w:r>
+    </w:p>
+    <w:p>
+      <w:pPr>
+        <w:spacing w:after="30" w:line="260"/>
+        <w:ind w:left="200"/>
+      </w:pPr>
+      <w:r>
+        <w:rPr>
+          <w:rFonts w:ascii="Arial" w:cs="Arial" w:eastAsia="Arial" w:hAnsi="Arial"/>
+          <w:color w:val="1B2A30"/>
+          <w:sz w:val="22"/>
+          <w:szCs w:val="22"/>
+        </w:rPr>
+        <w:t xml:space="preserve">☐   </w:t>
+      </w:r>
+      <w:r>
+        <w:rPr>
+          <w:rFonts w:ascii="Arial" w:cs="Arial" w:eastAsia="Arial" w:hAnsi="Arial"/>
+          <w:sz w:val="20"/>
+          <w:szCs w:val="20"/>
+        </w:rPr>
+        <w:t xml:space="preserve">Afterpay / buy now, pay later</w:t>
       </w:r>
     </w:p>
     <w:p>
@@ -4825,7 +4612,7 @@
           <w:sz w:val="17"/>
           <w:szCs w:val="17"/>
         </w:rPr>
-        <w:t xml:space="preserve">e.g. 30% up front on jobs over £1,000</w:t>
+        <w:t xml:space="preserve">e.g. 30% up front on jobs over $1,000</w:t>
       </w:r>
     </w:p>
     <w:p>
@@ -5489,7 +5276,7 @@
           <w:sz w:val="21"/>
           <w:szCs w:val="21"/>
         </w:rPr>
-        <w:t xml:space="preserve">Photos of the van livery and uniform</w:t>
+        <w:t xml:space="preserve">Photos of the van signwriting and uniform</w:t>
       </w:r>
     </w:p>
     <w:p>
@@ -6571,7 +6358,7 @@
           <w:sz w:val="17"/>
           <w:szCs w:val="17"/>
         </w:rPr>
-        <w:t xml:space="preserve">e.g. Checkatrade, Trustpilot, MyBuilder, Rated People, Yelp, Angi — paste the links</w:t>
+        <w:t xml:space="preserve">e.g. hipages, Oneflare, ServiceSeeking, Airtasker, Facebook — paste the links</w:t>
       </w:r>
     </w:p>
     <w:p>
@@ -6728,7 +6515,7 @@
           <w:sz w:val="17"/>
           <w:szCs w:val="17"/>
         </w:rPr>
-        <w:t xml:space="preserve">e.g. "Found a fault two other sparkies had missed." — Dave, Shirley</w:t>
+        <w:t xml:space="preserve">e.g. "Found a fault two other sparkies had missed." — Dave, Frankston</w:t>
       </w:r>
     </w:p>
     <w:p>
@@ -6856,7 +6643,7 @@
           <w:sz w:val="17"/>
           <w:szCs w:val="17"/>
         </w:rPr>
-        <w:t xml:space="preserve">e.g. Victorian semi in Moseley — no earth on the lighting circuit, rewired over 4 days while family stayed in…</w:t>
+        <w:t xml:space="preserve">e.g. 1950s weatherboard in Cheltenham — ceramic fuses, no safety switches. New switchboard and rewire over 3 days…</w:t>
       </w:r>
     </w:p>
     <w:p>
@@ -7351,30 +7138,30 @@
           <w:sz w:val="20"/>
           <w:szCs w:val="20"/>
         </w:rPr>
-        <w:t xml:space="preserve">Landlords</w:t>
-      </w:r>
-    </w:p>
-    <w:p>
-      <w:pPr>
-        <w:spacing w:after="30" w:line="260"/>
-        <w:ind w:left="200"/>
-      </w:pPr>
-      <w:r>
-        <w:rPr>
-          <w:rFonts w:ascii="Arial" w:cs="Arial" w:eastAsia="Arial" w:hAnsi="Arial"/>
-          <w:color w:val="1B2A30"/>
-          <w:sz w:val="22"/>
-          <w:szCs w:val="22"/>
-        </w:rPr>
-        <w:t xml:space="preserve">☐   </w:t>
-      </w:r>
-      <w:r>
-        <w:rPr>
-          <w:rFonts w:ascii="Arial" w:cs="Arial" w:eastAsia="Arial" w:hAnsi="Arial"/>
-          <w:sz w:val="20"/>
-          <w:szCs w:val="20"/>
-        </w:rPr>
-        <w:t xml:space="preserve">Letting &amp; estate agents</w:t>
+        <w:t xml:space="preserve">Landlords / rental providers</w:t>
+      </w:r>
+    </w:p>
+    <w:p>
+      <w:pPr>
+        <w:spacing w:after="30" w:line="260"/>
+        <w:ind w:left="200"/>
+      </w:pPr>
+      <w:r>
+        <w:rPr>
+          <w:rFonts w:ascii="Arial" w:cs="Arial" w:eastAsia="Arial" w:hAnsi="Arial"/>
+          <w:color w:val="1B2A30"/>
+          <w:sz w:val="22"/>
+          <w:szCs w:val="22"/>
+        </w:rPr>
+        <w:t xml:space="preserve">☐   </w:t>
+      </w:r>
+      <w:r>
+        <w:rPr>
+          <w:rFonts w:ascii="Arial" w:cs="Arial" w:eastAsia="Arial" w:hAnsi="Arial"/>
+          <w:sz w:val="20"/>
+          <w:szCs w:val="20"/>
+        </w:rPr>
+        <w:t xml:space="preserve">Real estate agents &amp; property managers</w:t>
       </w:r>
     </w:p>
     <w:p>
@@ -7542,7 +7329,7 @@
           <w:sz w:val="17"/>
           <w:szCs w:val="17"/>
         </w:rPr>
-        <w:t xml:space="preserve">e.g. About 30 — mostly word of mouth and Checkatrade</w:t>
+        <w:t xml:space="preserve">e.g. About 30 — mostly word of mouth and hipages</w:t>
       </w:r>
     </w:p>
     <w:p>
@@ -8173,7 +7960,7 @@
           <w:sz w:val="17"/>
           <w:szCs w:val="17"/>
         </w:rPr>
-        <w:t xml:space="preserve">e.g. ServiceM8 · Tradify · Jobber · Commusoft · Housecall Pro · none</w:t>
+        <w:t xml:space="preserve">e.g. ServiceM8 · Tradify · Fergus · simPRO · AroFlo · none</w:t>
       </w:r>
     </w:p>
     <w:p>
@@ -8690,7 +8477,7 @@
           <w:sz w:val="17"/>
           <w:szCs w:val="17"/>
         </w:rPr>
-        <w:t xml:space="preserve">e.g. Started as an apprentice at 17 with a firm in Redditch, went out on my own in 2011 after…</w:t>
+        <w:t xml:space="preserve">e.g. Did my apprenticeship with a firm in Dandenong, went out on my own in 2015 after…</w:t>
       </w:r>
     </w:p>
     <w:p>
@@ -9038,7 +8825,7 @@
           <w:sz w:val="17"/>
           <w:szCs w:val="17"/>
         </w:rPr>
-        <w:t xml:space="preserve">e.g. Company number, registered office, scheme registration number</w:t>
+        <w:t xml:space="preserve">e.g. ABN, REC number, licence number</w:t>
       </w:r>
     </w:p>
     <w:p>
@@ -9072,7 +8859,7 @@
           <w:sz w:val="17"/>
           <w:szCs w:val="17"/>
         </w:rPr>
-        <w:t xml:space="preserve">Several schemes require members to publish one. If you have wording from them, paste it here.</w:t>
+        <w:t xml:space="preserve">How a customer raises a problem, and what you do about it. If a trade association you belong to has wording for this, paste it here.</w:t>
       </w:r>
     </w:p>
     <w:p>
@@ -9263,7 +9050,7 @@
           <w:sz w:val="20"/>
           <w:szCs w:val="20"/>
         </w:rPr>
-        <w:t xml:space="preserve">Scheme and trade body badges (NICEIC, NAPIT and the rest)</w:t>
+        <w:t xml:space="preserve">Trade association badges (Master Electricians, NECA and the rest)</w:t>
       </w:r>
     </w:p>
     <w:p>

</xml_diff>